<commit_message>
Reword the food case studies as literature-based model documentation
The three case studies (chocolate, coffee, meat) addressed students: the
utilities were "supplied by the utility system you design", readers were to
"check your own problem-table calculation", and they ended with "further
reading for students", with the course's "rs" and "qt" table names in the
headings. They now read as documentation of the model data: neutral
wording, plain section names, energy targets stated as results, and under
the title the authors, their affiliations and a scope paragraph that names
the database model and the literature its data were compiled from. Tables,
figure and references are unchanged.

Co-Authored-By: Claude Opus 5.5 <noreply@anthropic.com>
</commit_message>
<xml_diff>
--- a/3-IndustrialProcesses/FoodAndBeverage/Chocolate/Documents/PR1casestudyChocolate.docx
+++ b/3-IndustrialProcesses/FoodAndBeverage/Chocolate/Documents/PR1casestudyChocolate.docx
@@ -20,6 +20,34 @@
     </w:p>
     <w:p>
       <w:pPr>
+        <w:spacing w:after="100"/>
+      </w:pPr>
+      <w:r>
+        <w:rPr>
+          <w:rFonts w:ascii="Arial" w:cs="Arial" w:eastAsia="Arial" w:hAnsi="Arial"/>
+          <w:color w:val="404040"/>
+          <w:sz w:val="24"/>
+          <w:szCs w:val="24"/>
+        </w:rPr>
+        <w:t xml:space="preserve">Process data for mass and heat integration, compiled from the literature</w:t>
+      </w:r>
+    </w:p>
+    <w:p>
+      <w:pPr>
+        <w:spacing w:after="20"/>
+      </w:pPr>
+      <w:r>
+        <w:rPr>
+          <w:rFonts w:ascii="Arial" w:cs="Arial" w:eastAsia="Arial" w:hAnsi="Arial"/>
+          <w:color w:val="1F3864"/>
+          <w:sz w:val="20"/>
+          <w:szCs w:val="20"/>
+        </w:rPr>
+        <w:t xml:space="preserve">Daniel Flórez-Orrego, Meire Ribeiro Domingos, Pullah Bhatnagar, Oktay Boztas</w:t>
+      </w:r>
+    </w:p>
+    <w:p>
+      <w:pPr>
         <w:pBdr>
           <w:bottom w:val="single" w:color="1F3864" w:sz="6" w:space="4"/>
         </w:pBdr>
@@ -28,11 +56,26 @@
       <w:r>
         <w:rPr>
           <w:rFonts w:ascii="Arial" w:cs="Arial" w:eastAsia="Arial" w:hAnsi="Arial"/>
-          <w:color w:val="404040"/>
-          <w:sz w:val="24"/>
-          <w:szCs w:val="24"/>
+          <w:i/>
+          <w:iCs/>
+          <w:color w:val="595959"/>
+          <w:sz w:val="18"/>
+          <w:szCs w:val="18"/>
         </w:rPr>
-        <w:t xml:space="preserve">Process data for mass and heat integration: rs and qt tables</w:t>
+        <w:t xml:space="preserve">Industrial Process and Energy Systems Engineering (IPESE) group, EPFL, Sion, Switzerland</w:t>
+      </w:r>
+    </w:p>
+    <w:p>
+      <w:pPr>
+        <w:spacing w:after="120" w:before="0" w:line="264"/>
+      </w:pPr>
+      <w:r>
+        <w:rPr>
+          <w:rFonts w:ascii="Arial" w:cs="Arial" w:eastAsia="Arial" w:hAnsi="Arial"/>
+          <w:sz w:val="20"/>
+          <w:szCs w:val="20"/>
+        </w:rPr>
+        <w:t xml:space="preserve">This case study describes the process data of the milk chocolate model (Chocolate_PR1) of the IETS Task XXIV database of ex-ante models: the material flows, the process electricity and the 45 thermal streams of a plant that processes whole cocoa beans (route PR1), per tonne of chocolate. The data are compiled from a review of the literature on the Swiss chocolate industry, chiefly the sector energy profiles and pinch analysis of Bhadbhade et al. (2023, 2024), completed with published recipes and compositions, sector statistics and refrigeration measurements. Table 5 gives the source of each value.</w:t>
       </w:r>
     </w:p>
     <w:p>
@@ -49,7 +92,7 @@
           <w:sz w:val="26"/>
           <w:szCs w:val="26"/>
         </w:rPr>
-        <w:t xml:space="preserve">1. Process</w:t>
+        <w:t xml:space="preserve">1. Process description</w:t>
       </w:r>
     </w:p>
     <w:p>
@@ -375,7 +418,7 @@
           <w:sz w:val="20"/>
           <w:szCs w:val="20"/>
         </w:rPr>
-        <w:t xml:space="preserve">Utilities are not part of the process data: heat, refrigeration and cooling are supplied by the utility system you design.</w:t>
+        <w:t xml:space="preserve">Utilities are not part of the process data: heat, refrigeration and cooling are supplied by a utility system outside the model boundary.</w:t>
       </w:r>
     </w:p>
     <w:p>
@@ -455,7 +498,7 @@
           <w:sz w:val="26"/>
           <w:szCs w:val="26"/>
         </w:rPr>
-        <w:t xml:space="preserve">3. rs: material flows</w:t>
+        <w:t xml:space="preserve">3. Material flows</w:t>
       </w:r>
     </w:p>
     <w:p>
@@ -3265,7 +3308,7 @@
           <w:sz w:val="26"/>
           <w:szCs w:val="26"/>
         </w:rPr>
-        <w:t xml:space="preserve">4. rs: process electricity</w:t>
+        <w:t xml:space="preserve">4. Process electricity</w:t>
       </w:r>
     </w:p>
     <w:p>
@@ -3278,7 +3321,7 @@
           <w:sz w:val="20"/>
           <w:szCs w:val="20"/>
         </w:rPr>
-        <w:t xml:space="preserve">Table 2 lists only the electricity that the process itself consumes. Heat and refrigeration demands are not included here: they are the qt streams of Table 3 and must be supplied by utilities that you select and size (boilers, heat pumps, refrigeration plant, cooling water).</w:t>
+        <w:t xml:space="preserve">Table 2 lists only the electricity that the process itself consumes. Heat and refrigeration demands are not included: they are the thermal streams of Table 3, to be met by utilities such as boilers, heat pumps, a refrigeration plant and cooling water.</w:t>
       </w:r>
     </w:p>
     <w:p>
@@ -3916,7 +3959,7 @@
           <w:sz w:val="26"/>
           <w:szCs w:val="26"/>
         </w:rPr>
-        <w:t xml:space="preserve">5. qt: thermal streams</w:t>
+        <w:t xml:space="preserve">5. Thermal streams</w:t>
       </w:r>
     </w:p>
     <w:p>
@@ -14290,7 +14333,7 @@
           <w:sz w:val="26"/>
           <w:szCs w:val="26"/>
         </w:rPr>
-        <w:t xml:space="preserve">6. Reference targets</w:t>
+        <w:t xml:space="preserve">6. Energy targets</w:t>
       </w:r>
     </w:p>
     <w:p>
@@ -14303,7 +14346,7 @@
           <w:sz w:val="20"/>
           <w:szCs w:val="20"/>
         </w:rPr>
-        <w:t xml:space="preserve">Students can check their own problem-table or composite-curve calculation against these targets for the 45 streams of Table 3.</w:t>
+        <w:t xml:space="preserve">The problem-table analysis of the 45 streams of Table 3, with ΔTmin = 10 K, gives the minimum energy targets of Table 4.</w:t>
       </w:r>
     </w:p>
     <w:p>

</xml_diff>